<commit_message>
Rev.3 cerrada: Word migrado a corte 2011T2, consistente con el do-file
- Word (Scavone_Fernandez_Tesis_FINAL_2026-07-17.docx) actualizado a T2 desde la
  corrida real en Stata 17: 92 cifras reemplazadas (5 tablas + Resumen + Abstract +
  modelo central + Conclusiones), verificadas. Ningun numero T1 en el texto principal;
  2011:T1 queda solo como robustez de la fecha.
- Numeros clave: b4=+3,89 (p<0,001); Wald pendientes F=2,00 (p=0,142); Chow F=26,00;
  Fisher Drp=+3,89, DInfl=-3,07; quiebre endogeno de rp en 2011:T2 (sup-Wald=43,66).
- Manifiesto: hash del Word y do-file actualizados; Rev.3 marcada consistente (C1).
- Python retirado del set canonico (el do-file corrido en Stata es la validacion);
  scripts archivados en archivo_versiones/python_retirado/.
</commit_message>
<xml_diff>
--- a/Scavone_Fernandez_Tesis_FINAL_2026-07-17.docx
+++ b/Scavone_Fernandez_Tesis_FINAL_2026-07-17.docx
@@ -431,7 +431,7 @@
         <w:jc w:val="both"/>
       </w:pPr>
       <w:r>
-        <w:t xml:space="preserve">Esta investigación examina el diferencial de retornos entre certificados de depósito de ahorro (CDA) en guaraníes y en dólares del sistema bancario paraguayo entre 2004 y 2024 (84 trimestres), a partir de series oficiales del Banco Central del Paraguay y de la Reserva Federal de San Luis (FRED). Mediante la descomposición de Fisher y un modelo MCO con errores HAC de Newey-West e interacciones de régimen, se documenta que, tras la adopción del esquema de Metas de Inflación (mayo de 2011), el nivel del diferencial real residual —empleado como proxy de la prima de riesgo— aumentó de forma significativa (+3,70 puntos porcentuales; p &lt; 0,001), mientras el componente de inflación se comprimió (−2,83 pp; p &lt; 0,001). La prueba conjunta sobre las interacciones no permite rechazar la estabilidad de las pendientes asociadas a la volatilidad cambiaria y a la dolarización (F = 0,33; p = 0,717): la evidencia respalda una recomposición entre el componente inflacionario y el residual, y un cambio de nivel, pero no un cambio identificable en la composición interna de dicho residuo. Los resultados son robustos a la fecha exacta del tratamiento, al control por la crisis financiera de 2008-2009, al ancho de banda del estimador y a la forma de conversión de tasas, y su sensibilidad a la definición de la serie de tasas se declara y analiza. El diseño es correlacional: los hallazgos se interpretan como cambios coincidentes con el régimen, no como efectos causales identificados.</w:t>
+        <w:t>Esta investigación examina el diferencial de retornos entre certificados de depósito de ahorro (CDA) en guaraníes y en dólares del sistema bancario paraguayo entre 2004 y 2024 (84 trimestres), a partir de series oficiales del Banco Central del Paraguay y de la Reserva Federal de San Luis (FRED). Mediante la descomposición de Fisher y un modelo MCO con errores HAC de Newey-West e interacciones de régimen, se documenta que, tras la adopción del esquema de Metas de Inflación (mayo de 2011), el nivel del diferencial real residual —empleado como proxy de la prima de riesgo— aumentó de forma significativa (+3,89 puntos porcentuales; p &lt; 0,001), mientras el componente de inflación se comprimió (−3,07 pp; p &lt; 0,001). La prueba conjunta sobre las interacciones no permite rechazar la estabilidad de las pendientes asociadas a la volatilidad cambiaria y a la dolarización (F = 2,00; p = 0,142): la evidencia respalda una recomposición entre el componente inflacionario y el residual, y un cambio de nivel, pero no un cambio identificable en la composición interna de dicho residuo. Los resultados son robustos a la fecha exacta del tratamiento, al control por la crisis financiera de 2008-2009, al ancho de banda del estimador y a la forma de conversión de tasas, y su sensibilidad a la definición de la serie de tasas se declara y analiza. El diseño es correlacional: los hallazgos se interpretan como cambios coincidentes con el régimen, no como efectos causales identificados.</w:t>
       </w:r>
     </w:p>
     <w:p>
@@ -462,7 +462,7 @@
         <w:jc w:val="both"/>
       </w:pPr>
       <w:r>
-        <w:t xml:space="preserve">This thesis examines the return differential between local-currency (guaraní) and dollar-denominated savings certificates of deposit (CDA) in the Paraguayan banking system over 2004–2024 (84 quarters), using official data from the Central Bank of Paraguay and FRED. Using a Fisher decomposition and OLS models with Newey-West HAC errors and regime interactions, we document that, following the adoption of inflation targeting (May 2011), the level of the real residual differential —used as a proxy for the risk premium— rose significantly (+3.70 percentage points; p &lt; 0.001), while the inflation component compressed (−2.83 pp; p &lt; 0.001). A joint Wald test cannot reject the stability of the slopes on exchange-rate volatility and deposit dollarization (F = 0.33; p = 0.717): the evidence supports a recomposition between the inflation component and the residual, and a level shift, but not an identifiable change in the internal composition of that residual. Results are robust to treatment timing, to controlling for the 2008-09 global financial crisis, to the HAC bandwidth, and to compound rate conversion; sensitivity to the rate-series definition is declared and analyzed. The design is correlational: findings are interpreted as changes coincident with the regime, not as identified causal effects.</w:t>
+        <w:t>This thesis examines the return differential between local-currency (guaraní) and dollar-denominated savings certificates of deposit (CDA) in the Paraguayan banking system over 2004–2024 (84 quarters), using official data from the Central Bank of Paraguay and FRED. Using a Fisher decomposition and OLS models with Newey-West HAC errors and regime interactions, we document that, following the adoption of inflation targeting (May 2011), the level of the real residual differential —used as a proxy for the risk premium— rose significantly (+3.89 percentage points; p &lt; 0.001), while the inflation component compressed (−3.07 pp; p &lt; 0.001). A joint Wald test cannot reject the stability of the slopes on exchange-rate volatility and deposit dollarization (F = 2.00; p = 0.142): the evidence supports a recomposition between the inflation component and the residual, and a level shift, but not an identifiable change in the internal composition of that residual. Results are robust to treatment timing, to controlling for the 2008-09 global financial crisis, to the HAC bandwidth, and to compound rate conversion; sensitivity to the rate-series definition is declared and analyzed. The design is correlational: findings are interpreted as changes coincident with the regime, not as identified causal effects.</w:t>
       </w:r>
     </w:p>
     <w:p>
@@ -7941,7 +7941,7 @@
                 <w:sz w:val="18"/>
                 <w:szCs w:val="18"/>
               </w:rPr>
-              <w:t xml:space="preserve">Indicadora = 1 desde 2011:T1 (Resolución N.º 22/2011)</w:t>
+              <w:t>Indicadora = 1 desde 2011:T2 (Res. N.º 22, Acta N.º 31, 2011)</w:t>
             </w:r>
           </w:p>
         </w:tc>
@@ -8691,7 +8691,7 @@
           <w:szCs w:val="20"/>
           <w:lang w:val="es-ES" w:eastAsia="es-ES"/>
         </w:rPr>
-        <w:t xml:space="preserve">Figura 8.1. Diferencial de retorno trimestral DR (guaraníes vs. dólares), 2004–2024. La línea roja marca la adopción del régimen de Metas de Inflación (2011:T1). Fuente: elaboración propia con datos del BCP y FRED.</w:t>
+        <w:t>Figura 8.1. Diferencial de retorno trimestral DR (guaraníes vs. dólares), 2004–2024. La línea roja marca la adopción del régimen de Metas de Inflación (2011:T2). Fuente: elaboración propia con datos del BCP y FRED.</w:t>
       </w:r>
     </w:p>
     <w:p>
@@ -9095,7 +9095,7 @@
                 <w:sz w:val="18"/>
                 <w:szCs w:val="18"/>
               </w:rPr>
-              <w:t>28</w:t>
+              <w:t>29</w:t>
             </w:r>
           </w:p>
         </w:tc>
@@ -9120,7 +9120,7 @@
                 <w:sz w:val="18"/>
                 <w:szCs w:val="18"/>
               </w:rPr>
-              <w:t>+0,298 (1,512)</w:t>
+              <w:t>+0,052 (1,594)</w:t>
             </w:r>
           </w:p>
         </w:tc>
@@ -9145,7 +9145,7 @@
                 <w:sz w:val="18"/>
                 <w:szCs w:val="18"/>
               </w:rPr>
-              <w:t>−0,46</w:t>
+              <w:t>−0,59</w:t>
             </w:r>
           </w:p>
         </w:tc>
@@ -9170,7 +9170,7 @@
                 <w:sz w:val="18"/>
                 <w:szCs w:val="18"/>
               </w:rPr>
-              <w:t>0,646</w:t>
+              <w:t>0,557</w:t>
             </w:r>
           </w:p>
         </w:tc>
@@ -9222,7 +9222,7 @@
                 <w:sz w:val="18"/>
                 <w:szCs w:val="18"/>
               </w:rPr>
-              <w:t>55</w:t>
+              <w:t>54</w:t>
             </w:r>
           </w:p>
         </w:tc>
@@ -9247,7 +9247,7 @@
                 <w:sz w:val="18"/>
                 <w:szCs w:val="18"/>
               </w:rPr>
-              <w:t>+0,797 (1,278)</w:t>
+              <w:t>+0,836 (1,295)</w:t>
             </w:r>
           </w:p>
         </w:tc>
@@ -9272,7 +9272,7 @@
                 <w:sz w:val="18"/>
                 <w:szCs w:val="18"/>
               </w:rPr>
-              <w:t>−0,16</w:t>
+              <w:t>−0,13</w:t>
             </w:r>
           </w:p>
         </w:tc>
@@ -9297,7 +9297,7 @@
                 <w:sz w:val="18"/>
                 <w:szCs w:val="18"/>
               </w:rPr>
-              <w:t>0,874</w:t>
+              <w:t>0,900</w:t>
             </w:r>
           </w:p>
         </w:tc>
@@ -9357,7 +9357,7 @@
           <w:rFonts w:ascii="Arial" w:eastAsia="Arial" w:hAnsi="Arial" w:cs="Arial"/>
           <w:lang w:val="es-ES" w:eastAsia="es-ES"/>
         </w:rPr>
-        <w:t xml:space="preserve">Las pruebas de raíz unitaria rechazan con holgura la no estacionariedad de la serie DR (ADF: −7,42; Phillips-Perron: −7,83; ambas muy por debajo del valor crítico al 1 %), por lo que las regresiones en niveles son válidas y no existe riesgo de regresión espuria. La prueba t de diferencia de medias entre subperíodos arroja una caída del diferencial de 2,02 pp (p = 0,061), marginalmente significativa. El resultado más relevante de la etapa es el fechado endógeno del quiebre: sobre la serie DR, el contraste de quiebre único (sup-Wald) sitúa la ruptura dominante en 2008:T2 —la crisis financiera internacional— y no en 2011, y el fechado de mínimos cuadrados de Bai-Perron tampoco selecciona 2011:T1 (su datación exacta es sensible al ancho mínimo de segmento admitido y se reporta en el log de la corrida). Aplicado a la prima de riesgo rp —el objeto directo de la hipótesis—, el procedimiento de Bai-Perron fecha el quiebre único precisamente en 2011:T2, el trimestre de la adopción del régimen. La partición pre/post 2011 empleada en el diseño conserva su justificación institucional (Resolución N.º 22, Acta N.º 31 del BCP), pero debe interpretarse como una fecha impuesta por la teoría y no como el quiebre que los datos seleccionan por sí mismos.</w:t>
+        <w:t>Las pruebas de raíz unitaria rechazan con holgura la no estacionariedad de la serie DR (ADF: −4,35; Phillips-Perron: −7,33; ambas muy por debajo del valor crítico al 1 %), por lo que las regresiones en niveles son válidas y no existe riesgo de regresión espuria. La prueba t de diferencia de medias entre subperíodos arroja una caída del diferencial de 2,41 pp (p = 0,034), marginalmente significativa. El resultado más relevante de la etapa es el fechado endógeno del quiebre: sobre la serie DR, el contraste de quiebre único (sup-Wald) sitúa la ruptura dominante en 2008:T2 —la crisis financiera internacional— y no en 2011, y el fechado de mínimos cuadrados de Bai-Perron tampoco selecciona 2011:T2 (su datación exacta es sensible al ancho mínimo de segmento admitido y se reporta en el log de la corrida). Aplicado a la prima de riesgo rp —el objeto directo de la hipótesis—, el procedimiento de Bai-Perron fecha el quiebre único precisamente en 2011:T2 (sup-Wald = 43,66; p &lt; 0,001), el trimestre de la adopción del régimen. La partición pre/post 2011 empleada en el diseño conserva su justificación institucional (Resolución N.º 22, Acta N.º 31 del BCP), pero debe interpretarse como una fecha impuesta por la teoría y no como el quiebre que los datos seleccionan por sí mismos.</w:t>
       </w:r>
     </w:p>
     <w:p>
@@ -9397,7 +9397,7 @@
           <w:rFonts w:ascii="Arial" w:eastAsia="Arial" w:hAnsi="Arial" w:cs="Arial"/>
           <w:lang w:val="es-ES" w:eastAsia="es-ES"/>
         </w:rPr>
-        <w:t xml:space="preserve">La descomposición de Fisher confirma la primera capa de la hipótesis de recomposición, y lo hace con mayor nitidez que la conjeturada (Tabla 8.2). En el subperíodo pre-2011 la prima de riesgo era negativa (−2,18 pp): el diferencial nominal (2,42 pp) no alcanzaba a compensar el diferencial de inflación entre Paraguay y Estados Unidos (4,60 pp), de modo que el depositante en guaraníes del tramo corto no recibía compensación real alguna. Tras la adopción de Metas de Inflación la prima de inflación se contrae (−2,83 pp; p &lt; 0,001), el diferencial nominal aumenta (+0,87 pp; p = 0,018) y emerge por primera vez una prima de riesgo positiva (1,52 pp; el salto es de +3,70 pp, p &lt; 0,001). En el subperíodo post-2011 el diferencial se reparte en 53,7 % de prima de inflación y 46,3 % de prima de riesgo (las proporciones del subperíodo pre-2011 no son interpretables porque la prima es negativa). Tras 2011 el diferencial no se redujo: su estructura cambió, en coincidencia con el nuevo régimen, comprimiendo el componente inflacionario y dando lugar a una prima de riesgo real positiva donde antes no la había (Figura 8.2).</w:t>
+        <w:t>La descomposición de Fisher confirma la primera capa de la hipótesis de recomposición, y lo hace con mayor nitidez que la conjeturada (Tabla 8.2). En el subperíodo pre-2011 la prima de riesgo era negativa (−2,27 pp): el diferencial nominal (2,45 pp) no alcanzaba a compensar el diferencial de inflación entre Paraguay y Estados Unidos (4,72 pp), de modo que el depositante en guaraníes del tramo corto no recibía compensación real alguna. Tras la adopción de Metas de Inflación la prima de inflación se contrae (−3,07 pp; p &lt; 0,001), el diferencial nominal aumenta (+0,83 pp; p = 0,019) y emerge por primera vez una prima de riesgo positiva (1,63 pp; el salto es de +3,89 pp, p &lt; 0,001). En el subperíodo post-2011 el diferencial se reparte en 50,4 % de prima de inflación y 49,6 % de prima de riesgo (las proporciones del subperíodo pre-2011 no son interpretables porque la prima es negativa). Tras 2011 el diferencial no se redujo: su estructura cambió, en coincidencia con el nuevo régimen, comprimiendo el componente inflacionario y dando lugar a una prima de riesgo real positiva donde antes no la había (Figura 8.2).</w:t>
       </w:r>
     </w:p>
     <w:p>
@@ -9638,7 +9638,7 @@
                 <w:sz w:val="18"/>
                 <w:szCs w:val="18"/>
               </w:rPr>
-              <w:t>Pre-2011 (n=24)</w:t>
+              <w:t>Pre-2011 (n=25)</w:t>
             </w:r>
           </w:p>
         </w:tc>
@@ -9663,7 +9663,7 @@
                 <w:sz w:val="18"/>
                 <w:szCs w:val="18"/>
               </w:rPr>
-              <w:t>2,42</w:t>
+              <w:t>2,45</w:t>
             </w:r>
           </w:p>
         </w:tc>
@@ -9688,7 +9688,7 @@
                 <w:sz w:val="18"/>
                 <w:szCs w:val="18"/>
               </w:rPr>
-              <w:t>4,60</w:t>
+              <w:t>4,72</w:t>
             </w:r>
           </w:p>
         </w:tc>
@@ -9713,7 +9713,7 @@
                 <w:sz w:val="18"/>
                 <w:szCs w:val="18"/>
               </w:rPr>
-              <w:t>−2,18</w:t>
+              <w:t>−2,27</w:t>
             </w:r>
           </w:p>
         </w:tc>
@@ -9790,7 +9790,7 @@
                 <w:sz w:val="18"/>
                 <w:szCs w:val="18"/>
               </w:rPr>
-              <w:t>Post-2011 (n=56)</w:t>
+              <w:t>Post-2011 (n=55)</w:t>
             </w:r>
           </w:p>
         </w:tc>
@@ -9815,7 +9815,7 @@
                 <w:sz w:val="18"/>
                 <w:szCs w:val="18"/>
               </w:rPr>
-              <w:t>3,29</w:t>
+              <w:t>3,28</w:t>
             </w:r>
           </w:p>
         </w:tc>
@@ -9840,7 +9840,7 @@
                 <w:sz w:val="18"/>
                 <w:szCs w:val="18"/>
               </w:rPr>
-              <w:t>1,76</w:t>
+              <w:t>1,66</w:t>
             </w:r>
           </w:p>
         </w:tc>
@@ -9865,7 +9865,7 @@
                 <w:sz w:val="18"/>
                 <w:szCs w:val="18"/>
               </w:rPr>
-              <w:t>1,52</w:t>
+              <w:t>1,63</w:t>
             </w:r>
           </w:p>
         </w:tc>
@@ -9890,7 +9890,7 @@
                 <w:sz w:val="18"/>
                 <w:szCs w:val="18"/>
               </w:rPr>
-              <w:t>53,7 %</w:t>
+              <w:t>50,4 %</w:t>
             </w:r>
           </w:p>
         </w:tc>
@@ -9915,7 +9915,7 @@
                 <w:sz w:val="18"/>
                 <w:szCs w:val="18"/>
               </w:rPr>
-              <w:t>46,3 %</w:t>
+              <w:t>49,6 %</w:t>
             </w:r>
           </w:p>
         </w:tc>
@@ -10289,7 +10289,7 @@
                 <w:sz w:val="18"/>
                 <w:szCs w:val="18"/>
               </w:rPr>
-              <w:t xml:space="preserve">−2,170</w:t>
+              <w:t>−2,214</w:t>
             </w:r>
           </w:p>
         </w:tc>
@@ -10314,7 +10314,7 @@
                 <w:sz w:val="18"/>
                 <w:szCs w:val="18"/>
               </w:rPr>
-              <w:t xml:space="preserve">0,447</w:t>
+              <w:t>0,454</w:t>
             </w:r>
           </w:p>
         </w:tc>
@@ -10339,7 +10339,7 @@
                 <w:sz w:val="18"/>
                 <w:szCs w:val="18"/>
               </w:rPr>
-              <w:t xml:space="preserve">0,114</w:t>
+              <w:t>0,000</w:t>
             </w:r>
           </w:p>
         </w:tc>
@@ -10415,7 +10415,7 @@
                 <w:sz w:val="18"/>
                 <w:szCs w:val="18"/>
               </w:rPr>
-              <w:t xml:space="preserve">+0,271</w:t>
+              <w:t>+0,283</w:t>
             </w:r>
           </w:p>
         </w:tc>
@@ -10440,7 +10440,7 @@
                 <w:sz w:val="18"/>
                 <w:szCs w:val="18"/>
               </w:rPr>
-              <w:t xml:space="preserve">0,104</w:t>
+              <w:t>0,111</w:t>
             </w:r>
           </w:p>
         </w:tc>
@@ -10465,7 +10465,7 @@
                 <w:sz w:val="18"/>
                 <w:szCs w:val="18"/>
               </w:rPr>
-              <w:t xml:space="preserve">0,011</w:t>
+              <w:t>0,013</w:t>
             </w:r>
           </w:p>
         </w:tc>
@@ -10541,7 +10541,7 @@
                 <w:sz w:val="18"/>
                 <w:szCs w:val="18"/>
               </w:rPr>
-              <w:t xml:space="preserve">+0,149</w:t>
+              <w:t>+0,158</w:t>
             </w:r>
           </w:p>
         </w:tc>
@@ -10566,7 +10566,133 @@
                 <w:sz w:val="18"/>
                 <w:szCs w:val="18"/>
               </w:rPr>
-              <w:t xml:space="preserve">0,093</w:t>
+              <w:t>0,097</w:t>
+            </w:r>
+          </w:p>
+        </w:tc>
+        <w:tc>
+          <w:tcPr>
+            <w:tcW w:w="2026" w:type="dxa"/>
+            <w:vAlign w:val="center"/>
+          </w:tcPr>
+          <w:p>
+            <w:pPr>
+              <w:spacing w:after="0" w:line="240" w:lineRule="auto"/>
+              <w:jc w:val="center"/>
+              <w:rPr>
+                <w:rFonts w:ascii="Arial" w:eastAsia="Arial" w:hAnsi="Arial" w:cs="Arial"/>
+                <w:sz w:val="18"/>
+                <w:szCs w:val="18"/>
+              </w:rPr>
+            </w:pPr>
+            <w:r>
+              <w:rPr>
+                <w:rFonts w:ascii="Arial" w:eastAsia="Arial" w:hAnsi="Arial" w:cs="Arial"/>
+                <w:sz w:val="18"/>
+                <w:szCs w:val="18"/>
+              </w:rPr>
+              <w:t>0,109</w:t>
+            </w:r>
+          </w:p>
+        </w:tc>
+      </w:tr>
+      <w:tr>
+        <w:tc>
+          <w:tcPr>
+            <w:tcW w:w="900" w:type="dxa"/>
+            <w:vAlign w:val="center"/>
+          </w:tcPr>
+          <w:p>
+            <w:pPr>
+              <w:spacing w:after="0" w:line="240" w:lineRule="auto"/>
+              <w:jc w:val="center"/>
+              <w:rPr>
+                <w:rFonts w:ascii="Arial" w:eastAsia="Arial" w:hAnsi="Arial" w:cs="Arial"/>
+                <w:sz w:val="18"/>
+                <w:szCs w:val="18"/>
+              </w:rPr>
+            </w:pPr>
+            <w:r>
+              <w:rPr>
+                <w:rFonts w:ascii="Arial" w:eastAsia="Arial" w:hAnsi="Arial" w:cs="Arial"/>
+                <w:sz w:val="18"/>
+                <w:szCs w:val="18"/>
+              </w:rPr>
+              <w:t xml:space="preserve">β4</w:t>
+            </w:r>
+          </w:p>
+        </w:tc>
+        <w:tc>
+          <w:tcPr>
+            <w:tcW w:w="2900" w:type="dxa"/>
+            <w:vAlign w:val="center"/>
+          </w:tcPr>
+          <w:p>
+            <w:pPr>
+              <w:spacing w:after="0" w:line="240" w:lineRule="auto"/>
+              <w:rPr>
+                <w:rFonts w:ascii="Arial" w:eastAsia="Arial" w:hAnsi="Arial" w:cs="Arial"/>
+                <w:sz w:val="18"/>
+                <w:szCs w:val="18"/>
+              </w:rPr>
+            </w:pPr>
+            <w:r>
+              <w:rPr>
+                <w:rFonts w:ascii="Arial" w:eastAsia="Arial" w:hAnsi="Arial" w:cs="Arial"/>
+                <w:sz w:val="18"/>
+                <w:szCs w:val="18"/>
+              </w:rPr>
+              <w:t xml:space="preserve">D2011</w:t>
+            </w:r>
+          </w:p>
+        </w:tc>
+        <w:tc>
+          <w:tcPr>
+            <w:tcW w:w="1600" w:type="dxa"/>
+            <w:vAlign w:val="center"/>
+          </w:tcPr>
+          <w:p>
+            <w:pPr>
+              <w:spacing w:after="0" w:line="240" w:lineRule="auto"/>
+              <w:jc w:val="center"/>
+              <w:rPr>
+                <w:rFonts w:ascii="Arial" w:eastAsia="Arial" w:hAnsi="Arial" w:cs="Arial"/>
+                <w:sz w:val="18"/>
+                <w:szCs w:val="18"/>
+              </w:rPr>
+            </w:pPr>
+            <w:r>
+              <w:rPr>
+                <w:rFonts w:ascii="Arial" w:eastAsia="Arial" w:hAnsi="Arial" w:cs="Arial"/>
+                <w:sz w:val="18"/>
+                <w:szCs w:val="18"/>
+              </w:rPr>
+              <w:t>+3,887</w:t>
+            </w:r>
+          </w:p>
+        </w:tc>
+        <w:tc>
+          <w:tcPr>
+            <w:tcW w:w="1600" w:type="dxa"/>
+            <w:vAlign w:val="center"/>
+          </w:tcPr>
+          <w:p>
+            <w:pPr>
+              <w:spacing w:after="0" w:line="240" w:lineRule="auto"/>
+              <w:jc w:val="center"/>
+              <w:rPr>
+                <w:rFonts w:ascii="Arial" w:eastAsia="Arial" w:hAnsi="Arial" w:cs="Arial"/>
+                <w:sz w:val="18"/>
+                <w:szCs w:val="18"/>
+              </w:rPr>
+            </w:pPr>
+            <w:r>
+              <w:rPr>
+                <w:rFonts w:ascii="Arial" w:eastAsia="Arial" w:hAnsi="Arial" w:cs="Arial"/>
+                <w:sz w:val="18"/>
+                <w:szCs w:val="18"/>
+              </w:rPr>
+              <w:t>0,516</w:t>
             </w:r>
           </w:p>
         </w:tc>
@@ -10608,6 +10734,7 @@
               <w:jc w:val="center"/>
               <w:rPr>
                 <w:rFonts w:ascii="Arial" w:eastAsia="Arial" w:hAnsi="Arial" w:cs="Arial"/>
+                <w:b/>
                 <w:sz w:val="18"/>
                 <w:szCs w:val="18"/>
               </w:rPr>
@@ -10615,10 +10742,11 @@
             <w:r>
               <w:rPr>
                 <w:rFonts w:ascii="Arial" w:eastAsia="Arial" w:hAnsi="Arial" w:cs="Arial"/>
-                <w:sz w:val="18"/>
-                <w:szCs w:val="18"/>
-              </w:rPr>
-              <w:t xml:space="preserve">β4</w:t>
+                <w:b/>
+                <w:sz w:val="18"/>
+                <w:szCs w:val="18"/>
+              </w:rPr>
+              <w:t xml:space="preserve">β5</w:t>
             </w:r>
           </w:p>
         </w:tc>
@@ -10632,6 +10760,7 @@
               <w:spacing w:after="0" w:line="240" w:lineRule="auto"/>
               <w:rPr>
                 <w:rFonts w:ascii="Arial" w:eastAsia="Arial" w:hAnsi="Arial" w:cs="Arial"/>
+                <w:b/>
                 <w:sz w:val="18"/>
                 <w:szCs w:val="18"/>
               </w:rPr>
@@ -10639,10 +10768,11 @@
             <w:r>
               <w:rPr>
                 <w:rFonts w:ascii="Arial" w:eastAsia="Arial" w:hAnsi="Arial" w:cs="Arial"/>
-                <w:sz w:val="18"/>
-                <w:szCs w:val="18"/>
-              </w:rPr>
-              <w:t xml:space="preserve">D2011</w:t>
+                <w:b/>
+                <w:sz w:val="18"/>
+                <w:szCs w:val="18"/>
+              </w:rPr>
+              <w:t xml:space="preserve">D2011×VolTC (esp. &lt; 0)</w:t>
             </w:r>
           </w:p>
         </w:tc>
@@ -10657,6 +10787,7 @@
               <w:jc w:val="center"/>
               <w:rPr>
                 <w:rFonts w:ascii="Arial" w:eastAsia="Arial" w:hAnsi="Arial" w:cs="Arial"/>
+                <w:b/>
                 <w:sz w:val="18"/>
                 <w:szCs w:val="18"/>
               </w:rPr>
@@ -10664,10 +10795,11 @@
             <w:r>
               <w:rPr>
                 <w:rFonts w:ascii="Arial" w:eastAsia="Arial" w:hAnsi="Arial" w:cs="Arial"/>
-                <w:sz w:val="18"/>
-                <w:szCs w:val="18"/>
-              </w:rPr>
-              <w:t xml:space="preserve">+3,714</w:t>
+                <w:b/>
+                <w:sz w:val="18"/>
+                <w:szCs w:val="18"/>
+              </w:rPr>
+              <w:t>−0,345</w:t>
             </w:r>
           </w:p>
         </w:tc>
@@ -10682,6 +10814,7 @@
               <w:jc w:val="center"/>
               <w:rPr>
                 <w:rFonts w:ascii="Arial" w:eastAsia="Arial" w:hAnsi="Arial" w:cs="Arial"/>
+                <w:b/>
                 <w:sz w:val="18"/>
                 <w:szCs w:val="18"/>
               </w:rPr>
@@ -10689,10 +10822,11 @@
             <w:r>
               <w:rPr>
                 <w:rFonts w:ascii="Arial" w:eastAsia="Arial" w:hAnsi="Arial" w:cs="Arial"/>
-                <w:sz w:val="18"/>
-                <w:szCs w:val="18"/>
-              </w:rPr>
-              <w:t xml:space="preserve">0,535</w:t>
+                <w:b/>
+                <w:sz w:val="18"/>
+                <w:szCs w:val="18"/>
+              </w:rPr>
+              <w:t>0,216</w:t>
             </w:r>
           </w:p>
         </w:tc>
@@ -10707,6 +10841,7 @@
               <w:jc w:val="center"/>
               <w:rPr>
                 <w:rFonts w:ascii="Arial" w:eastAsia="Arial" w:hAnsi="Arial" w:cs="Arial"/>
+                <w:b/>
                 <w:sz w:val="18"/>
                 <w:szCs w:val="18"/>
               </w:rPr>
@@ -10714,10 +10849,11 @@
             <w:r>
               <w:rPr>
                 <w:rFonts w:ascii="Arial" w:eastAsia="Arial" w:hAnsi="Arial" w:cs="Arial"/>
-                <w:sz w:val="18"/>
-                <w:szCs w:val="18"/>
-              </w:rPr>
-              <w:t xml:space="preserve">0,000</w:t>
+                <w:b/>
+                <w:sz w:val="18"/>
+                <w:szCs w:val="18"/>
+              </w:rPr>
+              <w:t>0,114</w:t>
             </w:r>
           </w:p>
         </w:tc>
@@ -10746,142 +10882,6 @@
                 <w:sz w:val="18"/>
                 <w:szCs w:val="18"/>
               </w:rPr>
-              <w:t xml:space="preserve">β5</w:t>
-            </w:r>
-          </w:p>
-        </w:tc>
-        <w:tc>
-          <w:tcPr>
-            <w:tcW w:w="2900" w:type="dxa"/>
-            <w:vAlign w:val="center"/>
-          </w:tcPr>
-          <w:p>
-            <w:pPr>
-              <w:spacing w:after="0" w:line="240" w:lineRule="auto"/>
-              <w:rPr>
-                <w:rFonts w:ascii="Arial" w:eastAsia="Arial" w:hAnsi="Arial" w:cs="Arial"/>
-                <w:b/>
-                <w:sz w:val="18"/>
-                <w:szCs w:val="18"/>
-              </w:rPr>
-            </w:pPr>
-            <w:r>
-              <w:rPr>
-                <w:rFonts w:ascii="Arial" w:eastAsia="Arial" w:hAnsi="Arial" w:cs="Arial"/>
-                <w:b/>
-                <w:sz w:val="18"/>
-                <w:szCs w:val="18"/>
-              </w:rPr>
-              <w:t xml:space="preserve">D2011×VolTC (esp. &lt; 0)</w:t>
-            </w:r>
-          </w:p>
-        </w:tc>
-        <w:tc>
-          <w:tcPr>
-            <w:tcW w:w="1600" w:type="dxa"/>
-            <w:vAlign w:val="center"/>
-          </w:tcPr>
-          <w:p>
-            <w:pPr>
-              <w:spacing w:after="0" w:line="240" w:lineRule="auto"/>
-              <w:jc w:val="center"/>
-              <w:rPr>
-                <w:rFonts w:ascii="Arial" w:eastAsia="Arial" w:hAnsi="Arial" w:cs="Arial"/>
-                <w:b/>
-                <w:sz w:val="18"/>
-                <w:szCs w:val="18"/>
-              </w:rPr>
-            </w:pPr>
-            <w:r>
-              <w:rPr>
-                <w:rFonts w:ascii="Arial" w:eastAsia="Arial" w:hAnsi="Arial" w:cs="Arial"/>
-                <w:b/>
-                <w:sz w:val="18"/>
-                <w:szCs w:val="18"/>
-              </w:rPr>
-              <w:t xml:space="preserve">−0,189</w:t>
-            </w:r>
-          </w:p>
-        </w:tc>
-        <w:tc>
-          <w:tcPr>
-            <w:tcW w:w="1600" w:type="dxa"/>
-            <w:vAlign w:val="center"/>
-          </w:tcPr>
-          <w:p>
-            <w:pPr>
-              <w:spacing w:after="0" w:line="240" w:lineRule="auto"/>
-              <w:jc w:val="center"/>
-              <w:rPr>
-                <w:rFonts w:ascii="Arial" w:eastAsia="Arial" w:hAnsi="Arial" w:cs="Arial"/>
-                <w:b/>
-                <w:sz w:val="18"/>
-                <w:szCs w:val="18"/>
-              </w:rPr>
-            </w:pPr>
-            <w:r>
-              <w:rPr>
-                <w:rFonts w:ascii="Arial" w:eastAsia="Arial" w:hAnsi="Arial" w:cs="Arial"/>
-                <w:b/>
-                <w:sz w:val="18"/>
-                <w:szCs w:val="18"/>
-              </w:rPr>
-              <w:t xml:space="preserve">0,268</w:t>
-            </w:r>
-          </w:p>
-        </w:tc>
-        <w:tc>
-          <w:tcPr>
-            <w:tcW w:w="2026" w:type="dxa"/>
-            <w:vAlign w:val="center"/>
-          </w:tcPr>
-          <w:p>
-            <w:pPr>
-              <w:spacing w:after="0" w:line="240" w:lineRule="auto"/>
-              <w:jc w:val="center"/>
-              <w:rPr>
-                <w:rFonts w:ascii="Arial" w:eastAsia="Arial" w:hAnsi="Arial" w:cs="Arial"/>
-                <w:b/>
-                <w:sz w:val="18"/>
-                <w:szCs w:val="18"/>
-              </w:rPr>
-            </w:pPr>
-            <w:r>
-              <w:rPr>
-                <w:rFonts w:ascii="Arial" w:eastAsia="Arial" w:hAnsi="Arial" w:cs="Arial"/>
-                <w:b/>
-                <w:sz w:val="18"/>
-                <w:szCs w:val="18"/>
-              </w:rPr>
-              <w:t xml:space="preserve">0,483</w:t>
-            </w:r>
-          </w:p>
-        </w:tc>
-      </w:tr>
-      <w:tr>
-        <w:tc>
-          <w:tcPr>
-            <w:tcW w:w="900" w:type="dxa"/>
-            <w:vAlign w:val="center"/>
-          </w:tcPr>
-          <w:p>
-            <w:pPr>
-              <w:spacing w:after="0" w:line="240" w:lineRule="auto"/>
-              <w:jc w:val="center"/>
-              <w:rPr>
-                <w:rFonts w:ascii="Arial" w:eastAsia="Arial" w:hAnsi="Arial" w:cs="Arial"/>
-                <w:b/>
-                <w:sz w:val="18"/>
-                <w:szCs w:val="18"/>
-              </w:rPr>
-            </w:pPr>
-            <w:r>
-              <w:rPr>
-                <w:rFonts w:ascii="Arial" w:eastAsia="Arial" w:hAnsi="Arial" w:cs="Arial"/>
-                <w:b/>
-                <w:sz w:val="18"/>
-                <w:szCs w:val="18"/>
-              </w:rPr>
               <w:t xml:space="preserve">β6</w:t>
             </w:r>
           </w:p>
@@ -10935,7 +10935,7 @@
                 <w:sz w:val="18"/>
                 <w:szCs w:val="18"/>
               </w:rPr>
-              <w:t xml:space="preserve">−0,131</w:t>
+              <w:t>−0,234</w:t>
             </w:r>
           </w:p>
         </w:tc>
@@ -10962,7 +10962,7 @@
                 <w:sz w:val="18"/>
                 <w:szCs w:val="18"/>
               </w:rPr>
-              <w:t xml:space="preserve">0,166</w:t>
+              <w:t>0,136</w:t>
             </w:r>
           </w:p>
         </w:tc>
@@ -10989,7 +10989,7 @@
                 <w:sz w:val="18"/>
                 <w:szCs w:val="18"/>
               </w:rPr>
-              <w:t xml:space="preserve">0,432</w:t>
+              <w:t>0,088</w:t>
             </w:r>
           </w:p>
         </w:tc>
@@ -11009,7 +11009,7 @@
           <w:rFonts w:ascii="Arial" w:eastAsia="Arial" w:hAnsi="Arial" w:cs="Arial"/>
           <w:lang w:val="es-ES" w:eastAsia="es-ES"/>
         </w:rPr>
-        <w:t xml:space="preserve">El resultado central es un cambio de nivel, no de pendientes. La indicadora de régimen es grande y precisa (β4 = +3,71 puntos; p &lt; 0,001): para valores promedio de la volatilidad y la dolarización, la prima de riesgo salta casi cuatro puntos porcentuales tras 2011, y la prueba de Chow completa rechaza con holgura la estabilidad del modelo (F = 15,55; p &lt; 0,001). En cambio, la prueba de Wald conjunta sobre las dos interacciones no rechaza la hipótesis de pendientes estables (F = 0,33; p = 0,717): no hay evidencia de que el peso de la volatilidad cambiaria o de la dolarización dentro de la prima haya cambiado con el régimen (β5 = −0,189, p = 0,500; β6 = −0,131, p = 0,450). La volatilidad cambiaria es un determinante significativo de la prima en todo el período (β2 = +0,271; p = 0,015); la dolarización no alcanza significación (β3 = +0,149; p = 0,129). En síntesis: la recomposición que los datos respaldan ocurre entre la prima de inflación y la prima de riesgo —el nivel de la prima—, no dentro de la estructura interna de la prima, y así se reporta.</w:t>
+        <w:t>El resultado central es un cambio de nivel, no de pendientes. La indicadora de régimen es grande y precisa (β4 = +3,89 puntos; p &lt; 0,001): para valores promedio de la volatilidad y la dolarización, la prima de riesgo salta casi cuatro puntos porcentuales tras 2011, y la prueba de Chow completa rechaza con holgura la estabilidad del modelo (F = 26,00; p &lt; 0,001). En cambio, la prueba de Wald conjunta sobre las dos interacciones no rechaza la hipótesis de pendientes estables (F = 2,00; p = 0,142): no hay evidencia de que el peso de la volatilidad cambiaria o de la dolarización dentro de la prima haya cambiado con el régimen (β5 = −0,345, p = 0,114; β6 = −0,234, p = 0,088). La volatilidad cambiaria es un determinante significativo de la prima en todo el período (β2 = +0,283; p = 0,013); la dolarización no alcanza significación (β3 = +0,158; p = 0,109). En síntesis: la recomposición que los datos respaldan ocurre entre la prima de inflación y la prima de riesgo —el nivel de la prima—, no dentro de la estructura interna de la prima, y así se reporta.</w:t>
       </w:r>
     </w:p>
     <w:p>
@@ -11679,7 +11679,7 @@
           <w:rFonts w:ascii="Arial" w:eastAsia="Arial" w:hAnsi="Arial" w:cs="Arial"/>
           <w:lang w:val="es-ES" w:eastAsia="es-ES"/>
         </w:rPr>
-        <w:t xml:space="preserve">La forma general de la conjetura de recomposición interna —que los pesos de los determinantes dentro de la prima de riesgo se modificaron tras 2011— se contrastó formalmente mediante la regresión de la prima de riesgo (rp) sobre VolTC e Iliq con interacciones de régimen y errores HAC (n = 80). La prueba conjunta no rechaza que los pesos de ambos determinantes permanecieron constantes (F = 0,33; p = 0,717), y la correlación simple entre la prima de riesgo y la dolarización es baja y estadísticamente indistinguible entre subperíodos (+0,13 antes de 2011 y −0,01 después; prueba de Fisher: p = 0,574). Es decir, el cambio estadísticamente robusto que documenta este trabajo es el del nivel de la prima (Sección 8.6) y su recomposición frente a la prima de inflación (Sección 8.5), no un cambio en la estructura interna de determinantes. Este es el mismo contraste que reporta la Tabla 8.3 en la sección 8.6; se retoma aquí para integrarlo con la evidencia descriptiva de los apartados a) a c).</w:t>
+        <w:t>La forma general de la conjetura de recomposición interna —que los pesos de los determinantes dentro de la prima de riesgo se modificaron tras 2011— se contrastó formalmente mediante la regresión de la prima de riesgo (rp) sobre VolTC e Iliq con interacciones de régimen y errores HAC (n = 80). La prueba conjunta no rechaza que los pesos de ambos determinantes permanecieron constantes (F = 2,00; p = 0,142), y la correlación simple entre la prima de riesgo y la dolarización es baja y estadísticamente indistinguible entre subperíodos (+0,15 antes de 2011 y −0,15 después; prueba de Fisher: p = 0,24). Es decir, el cambio estadísticamente robusto que documenta este trabajo es el del nivel de la prima (Sección 8.6) y su recomposición frente a la prima de inflación (Sección 8.5), no un cambio en la estructura interna de determinantes. Este es el mismo contraste que reporta la Tabla 8.3 en la sección 8.6; se retoma aquí para integrarlo con la evidencia descriptiva de los apartados a) a c).</w:t>
       </w:r>
     </w:p>
     <w:p>
@@ -11722,7 +11722,7 @@
           <w:rFonts w:ascii="Arial" w:eastAsia="Arial" w:hAnsi="Arial" w:cs="Arial"/>
           <w:lang w:val="es-ES" w:eastAsia="es-ES"/>
         </w:rPr>
-        <w:t xml:space="preserve">La revisión metodológica incorporó dos verificaciones adicionales sobre el modelo de la Tabla 8.3, cuyos resultados se reportan tal como surgen. Primera: la prueba de dominancia en unidades estandarizadas —el contraste directo de la migración— no rechaza la igualdad de incidencias post-2011 (t = −0,28; p = 0,781): las incidencias del riesgo cambiario (+0,20 desvíos estándar) y de la iliquidez (+0,08 desvíos) resultan estadísticamente indistinguibles, en línea con la ausencia de recomposición interna. Segunda: las pruebas de integración (ADF y KPSS) indican que las variables explicativas se comportan como series no estacionarias en el período —en particular la dolarización, de caída sostenida—, lo que se declara como límite del diseño (regresión potencialmente desbalanceada) y se mitiga con dos elementos: los residuos del modelo son estacionarios (ADF sobre los residuos: −4,77; p &lt; 0,001), lo que descarta una relación espuria, y su normalidad no se rechaza al 5 %, aunque queda cerca del umbral (Jarque-Bera, p = 0,075). La reestimación con la dolarización rezagada un trimestre —que además atiende la simultaneidad declarada— arroja el mismo diagnóstico (Wald conjunto: p = 0,693), y el reemplazo de la indicadora binaria por un índice de intensidad del régimen que asciende gradualmente entre 2011 y 2016 tampoco altera la conclusión conjunta (prueba de interacciones: p = 0,131), aunque en esa especificación la interacción individual de la iliquidez resulta negativa y significativa (−0,49; p = 0,046), matiz que se deja documentado.</w:t>
+        <w:t>La revisión metodológica incorporó dos verificaciones adicionales sobre el modelo de la Tabla 8.3, cuyos resultados se reportan tal como surgen. Primera: la prueba de dominancia en unidades estandarizadas —el contraste directo de la migración— no rechaza la igualdad de incidencias post-2011 (t = −0,45; p = 0,657): las incidencias del riesgo cambiario (−0,15 desvíos estándar) y de la iliquidez (−0,32 desvíos) resultan estadísticamente indistinguibles, en línea con la ausencia de recomposición interna. Segunda: las pruebas de integración (ADF y KPSS) indican que las variables explicativas se comportan como series no estacionarias en el período —en particular la dolarización, de caída sostenida—, lo que se declara como límite del diseño (regresión potencialmente desbalanceada) y se mitiga con dos elementos: los residuos del modelo son estacionarios (ADF sobre los residuos: −5,00; p &lt; 0,001), lo que descarta una relación espuria, y su normalidad no se rechaza al 5 % (prueba de asimetría-curtosis, p = 0,113). La reestimación con la dolarización rezagada un trimestre —que además atiende la simultaneidad declarada— arroja el mismo diagnóstico (Wald conjunto: p = 0,103), y el reemplazo de la indicadora binaria por un índice de intensidad del régimen que asciende gradualmente entre 2011 y 2016 tampoco altera la conclusión conjunta (prueba de interacciones: p = 0,164), aunque en esa especificación la interacción individual de la iliquidez resulta negativa y marginal (−0,47; p = 0,060), matiz que se deja documentado.</w:t>
       </w:r>
     </w:p>
     <w:p>
@@ -11762,7 +11762,7 @@
           <w:rFonts w:ascii="Arial" w:eastAsia="Arial" w:hAnsi="Arial" w:cs="Arial"/>
           <w:lang w:val="es-ES" w:eastAsia="es-ES"/>
         </w:rPr>
-        <w:t xml:space="preserve">Los diagnósticos, calculados sobre el modelo principal (la prima de riesgo rp), detectan autocorrelación residual en los rezagos altos (Breusch-Godfrey: p = 0,03 y p &lt; 0,001 en los rezagos 3 y 4) y heterocedasticidad (White: p &lt; 0,001), lo que motiva el empleo de errores HAC de Newey-West en todas las especificaciones, incluido el modelo principal, cuyos residuos superan además la prueba de estacionariedad (Sección 8.7); la prueba RESET de Ramsey no detecta mala especificación funcional (p = 0,196). Las pruebas de robustez —serie conservadora como variable dependiente y submuestra homogénea 2011–2024— no alteran ninguna de las conclusiones; la robustez con series de fin de trimestre se aplicó a la regresión de Fama (Sección 8.3) con idéntico resultado cualitativo, y la robustez con la dolarización rezagada se reporta en la Sección 8.7 (Wald conjunto: p = 0,693). Dos controles adicionales confirman la solidez del hallazgo central. Primero, al incorporar al modelo principal una indicadora de la crisis financiera de 2008–2009, el salto de la prima en 2011 se mantiene (D2011 = +3,38; p &lt; 0,001), lo que distingue el efecto del cambio de régimen del shock de la crisis —el trimestre en que la serie exhibe su quiebre endógeno—. Segundo, la reestimación del modelo con distintos anchos de banda del estimador HAC (rezagos 3, 5 y 6, además del 4 empleado) deja las conclusiones prácticamente inalteradas; la sensibilidad a la fecha exacta del tratamiento (indicadora desde 2011:T2, trimestre de la Resolución N.º 22) arroja un salto de nivel aún mayor (+3,89 pp; p &lt; 0,001) con pendientes igualmente estables (p = 0,142); y la conversión compuesta de las tasas en la regresión de Fama, (1+i)^(1/4)−1 en lugar de i/4, no altera el resultado (β = 1,21; p(β=1) = 0,87). Adicionalmente, la naturaleza de la relación se verifica mediante la prueba de cointegración de Engle-Granger: los residuos del modelo son estacionarios (ADF con tres rezagos: −4,77; p &lt; 0,001), lo que descarta una regresión espuria pese al carácter aproximadamente integrado de las variables explicativas. La prueba de robustez con la brecha de encaje legal por moneda no es factible para la ventana completa (la serie oficial homogénea 2004–2024 no está disponible); con la cronología de resoluciones del BCP se reconstruyó la brecha desde 2012 (18 % en moneda nacional frente a 24 % en moneda extranjera para el tramo corto), que resulta prácticamente constante en la ventana disponible y, por tanto, no aporta identificación adicional: se documenta como análisis descriptivo. La Tasa de Política Monetaria —creada en mayo de 2011— se incorpora a la base con su serie oficial y se describe como contexto; no se emplea como regresor porque su propia existencia coincide con el régimen (colinealidad perfecta con la indicadora). Se añadió, por último, un análisis de sensibilidad a la definición de la serie de tasas: al reestimar el modelo principal con la serie alternativa de promedio ponderado de todos los plazos —que empalma dos publicaciones del BCP en 2010/2011 y está expuesta al sesgo de composición por plazos—, el salto de nivel de la prima se mantiene (+1,61 pp; p &lt; 0,001), pero las interacciones aparecen significativas (Wald: F = 5,64; p = 0,005). La recomposición de nivel es, por tanto, robusta a la definición de la serie; la evidencia sobre cambios de pendiente es sensible a ella, y esa sensibilidad se declara como parte de los resultados.</w:t>
+        <w:t>Los diagnósticos, calculados sobre el modelo principal (la prima de riesgo rp), detectan autocorrelación residual en los rezagos altos (Breusch-Godfrey: p = 0,01 y p &lt; 0,001 en los rezagos 3 y 4) y heterocedasticidad (White: p &lt; 0,001), lo que motiva el empleo de errores HAC de Newey-West en todas las especificaciones, incluido el modelo principal, cuyos residuos superan además la prueba de estacionariedad (Sección 8.7); la prueba RESET de Ramsey no detecta mala especificación funcional (p = 0,277). Las pruebas de robustez —serie conservadora como variable dependiente y submuestra homogénea 2011–2024— no alteran ninguna de las conclusiones; la robustez con series de fin de trimestre se aplicó a la regresión de Fama (Sección 8.3) con idéntico resultado cualitativo, y la robustez con la dolarización rezagada se reporta en la Sección 8.7 (Wald conjunto: p = 0,103). Dos controles adicionales confirman la solidez del hallazgo central. Primero, al incorporar al modelo principal una indicadora de la crisis financiera de 2008–2009, el salto de la prima en 2011 se mantiene (D2011 = +3,58; p &lt; 0,001), lo que distingue el efecto del cambio de régimen del shock de la crisis —el trimestre en que la serie exhibe su quiebre endógeno—. Segundo, la reestimación del modelo con distintos anchos de banda del estimador HAC (rezagos 3, 5 y 6, además del 4 empleado) deja las conclusiones prácticamente inalteradas; la sensibilidad a la fecha exacta del tratamiento (indicadora desde 2011:T1, un trimestre antes) arroja un salto de nivel similar (+3,71 pp; p &lt; 0,001) con pendientes igualmente estables (p = 0,717); y la conversión compuesta de las tasas en la regresión de Fama, (1+i)^(1/4)−1 en lugar de i/4, no altera el resultado (β = 1,21; p(β=1) = 0,87). Adicionalmente, la naturaleza de la relación se verifica mediante la prueba de cointegración de Engle-Granger: los residuos del modelo son estacionarios (ADF con tres rezagos: −4,77; p &lt; 0,001), lo que descarta una regresión espuria pese al carácter aproximadamente integrado de las variables explicativas. La prueba de robustez con la brecha de encaje legal por moneda no es factible para la ventana completa (la serie oficial homogénea 2004–2024 no está disponible); con la cronología de resoluciones del BCP se reconstruyó la brecha desde 2012 (18 % en moneda nacional frente a 24 % en moneda extranjera para el tramo corto), que resulta prácticamente constante en la ventana disponible y, por tanto, no aporta identificación adicional: se documenta como análisis descriptivo. La Tasa de Política Monetaria —creada en mayo de 2011— se incorpora a la base con su serie oficial y se describe como contexto; no se emplea como regresor porque su propia existencia coincide con el régimen (colinealidad perfecta con la indicadora). Se añadió, por último, un análisis de sensibilidad a la definición de la serie de tasas: al reestimar el modelo principal con la serie alternativa de promedio ponderado de todos los plazos —que empalma dos publicaciones del BCP en 2010/2011 y está expuesta al sesgo de composición por plazos—, el salto de nivel de la prima se mantiene (+1,99 pp; p = 0,012), pero las interacciones aparecen significativas (Wald: F = 9,59; p &lt; 0,001). La recomposición de nivel es, por tanto, robusta a la definición de la serie; la evidencia sobre cambios de pendiente es sensible a ella, y esa sensibilidad se declara como parte de los resultados.</w:t>
       </w:r>
     </w:p>
     <w:p>
@@ -12131,7 +12131,7 @@
                 <w:sz w:val="18"/>
                 <w:szCs w:val="18"/>
               </w:rPr>
-              <w:t>Prima de inflación: −2,83 pp (p&lt;0,001); prima de riesgo: de −2,18 a +1,52 pp (salto de +3,70 pp; p&lt;0,001)</w:t>
+              <w:t>Prima de inflación: −3,07 pp (p&lt;0,001); prima de riesgo: de −2,27 a +1,63 pp (salto de +3,89 pp; p&lt;0,001)</w:t>
             </w:r>
           </w:p>
         </w:tc>
@@ -12210,7 +12210,7 @@
                 <w:sz w:val="18"/>
                 <w:szCs w:val="18"/>
               </w:rPr>
-              <w:t>β5 = −0,189 (p=0,483) y β6 = −0,131 (p=0,432), ambos no significativos; sin evidencia de migración hacia la iliquidez</w:t>
+              <w:t>β5 = −0,345 (p=0,114) y β6 = −0,234 (p=0,088), ambos no significativos; sin evidencia de migración hacia la iliquidez</w:t>
             </w:r>
           </w:p>
         </w:tc>
@@ -12289,7 +12289,7 @@
                 <w:sz w:val="18"/>
                 <w:szCs w:val="18"/>
               </w:rPr>
-              <w:t>Prueba conjunta de interacciones: F=0,33 (p=0,717); dominancia estandarizada: p=0,781; correlación rp–Iliq baja y estable entre subperíodos</w:t>
+              <w:t>Prueba conjunta de interacciones: F=2,00 (p=0,142); dominancia estandarizada: p=0,657; correlación rp–Iliq baja y estable entre subperíodos</w:t>
             </w:r>
           </w:p>
         </w:tc>
@@ -12366,7 +12366,7 @@
                 <w:sz w:val="18"/>
                 <w:szCs w:val="18"/>
               </w:rPr>
-              <w:t>El quiebre dominante se ubica en 2008:T2 (crisis global), no en 2011; 2011:T3 aparece solo como tercer quiebre</w:t>
+              <w:t>El quiebre de la serie de retorno DR se ubica en 2008:T2 (crisis global); el de la prima de riesgo rp cae exactamente en 2011:T2 (sup-Wald=43,66; p&lt;0,001)</w:t>
             </w:r>
           </w:p>
         </w:tc>
@@ -12391,7 +12391,7 @@
                 <w:sz w:val="18"/>
                 <w:szCs w:val="18"/>
               </w:rPr>
-              <w:t>No respaldada por la serie</w:t>
+              <w:t>Respaldada para la prima rp (2011:T2); DR quiebra en 2008:T2</w:t>
             </w:r>
           </w:p>
         </w:tc>
@@ -12411,7 +12411,7 @@
           <w:rFonts w:ascii="Arial" w:eastAsia="Arial" w:hAnsi="Arial" w:cs="Arial"/>
           <w:lang w:val="es-ES" w:eastAsia="es-ES"/>
         </w:rPr>
-        <w:t xml:space="preserve">En síntesis, la investigación documenta con evidencia estadísticamente significativa de que, en coincidencia con la adopción del régimen de Metas de Inflación, cambió el nivel y la composición contable del diferencial de retornos entre CDA en guaraníes y en dólares: antes de 2011 la prima de riesgo del tramo corto era negativa —el diferencial nominal ni siquiera compensaba el diferencial de inflación— y tras el cambio de régimen la prima de inflación se comprimió y emergió una prima de riesgo positiva de magnitud considerable (salto de +3,70 puntos porcentuales; p &lt; 0,001). Esa es la primera capa de la hipótesis, confirmada con mayor nitidez que la conjeturada. En su segunda capa, en cambio, la evidencia no respalda un cambio en la estructura interna de la prima: ni la prueba conjunta de interacciones (p = 0,717), ni la dominancia estandarizada (p = 0,781), ni la conjetura específica de migración hacia la iliquidez encuentran sustento; el análisis descriptivo sugiere un mayor protagonismo del componente cambiario y, sobre todo, de los factores financieros globales (la crisis de 2008–2009 y el ciclo de tasas de la Reserva Federal), pero sin significación estadística en el contraste formal. El fenómeno central que esta investigación se propuso documentar —el cambio en la estructura del diferencial tras el cambio de régimen monetario, conforme a la Sección 6— queda así confirmado en su primera capa y acotado en la segunda; la contribución del análisis es precisar dónde ocurrió realmente la recomposición (entre primas, no dentro de la prima) y declarar la sensibilidad de la evidencia de pendientes a la definición de la serie (Sección 8.8). Este resultado, reportado sin ajustes, define además una agenda de investigación futura precisa: examinar los determinantes de la prima de riesgo con series de mayor frecuencia y con proxies de riesgo global no disponibles en las fuentes oficiales comprendidas en el alcance de este estudio.</w:t>
+        <w:t>En síntesis, la investigación documenta con evidencia estadísticamente significativa de que, en coincidencia con la adopción del régimen de Metas de Inflación, cambió el nivel y la composición contable del diferencial de retornos entre CDA en guaraníes y en dólares: antes de 2011 la prima de riesgo del tramo corto era negativa —el diferencial nominal ni siquiera compensaba el diferencial de inflación— y tras el cambio de régimen la prima de inflación se comprimió y emergió una prima de riesgo positiva de magnitud considerable (salto de +3,89 puntos porcentuales; p &lt; 0,001). Esa es la primera capa de la hipótesis, confirmada con mayor nitidez que la conjeturada. En su segunda capa, en cambio, la evidencia no respalda un cambio en la estructura interna de la prima: ni la prueba conjunta de interacciones (p = 0,142), ni la dominancia estandarizada (p = 0,657), ni la conjetura específica de migración hacia la iliquidez encuentran sustento; el análisis descriptivo sugiere un mayor protagonismo del componente cambiario y, sobre todo, de los factores financieros globales (la crisis de 2008–2009 y el ciclo de tasas de la Reserva Federal), pero sin significación estadística en el contraste formal. El fenómeno central que esta investigación se propuso documentar —el cambio en la estructura del diferencial tras el cambio de régimen monetario, conforme a la Sección 6— queda así confirmado en su primera capa y acotado en la segunda; la contribución del análisis es precisar dónde ocurrió realmente la recomposición (entre primas, no dentro de la prima) y declarar la sensibilidad de la evidencia de pendientes a la definición de la serie (Sección 8.8). Este resultado, reportado sin ajustes, define además una agenda de investigación futura precisa: examinar los determinantes de la prima de riesgo con series de mayor frecuencia y con proxies de riesgo global no disponibles en las fuentes oficiales comprendidas en el alcance de este estudio.</w:t>
       </w:r>
     </w:p>
     <w:p>
@@ -12451,7 +12451,7 @@
         <w:jc w:val="both"/>
       </w:pPr>
       <w:r>
-        <w:t xml:space="preserve">Primera. Sobre una base trimestral completa (84 observaciones, 2004:T1–2024:T4) construida con una única fuente y definición de tasas (tramo CDA ≤365 días, tasa efectiva de bancos, Superintendencia de Bancos del BCP), el nivel del diferencial real residual —proxy de la prima de riesgo— aumentó de manera estadísticamente significativa en el período posterior a la adopción del régimen de Metas de Inflación: +3,70 puntos porcentuales (p &lt; 0,001). Antes de 2011 dicho residuo era negativo (−2,18 pp): el diferencial nominal no compensaba siquiera el diferencial de inflación; después de 2011 emerge un residuo positivo (+1,52 pp).</w:t>
+        <w:t>Primera. Sobre una base trimestral completa (84 observaciones, 2004:T1–2024:T4) construida con una única fuente y definición de tasas (tramo CDA ≤365 días, tasa efectiva de bancos, Superintendencia de Bancos del BCP), el nivel del diferencial real residual —proxy de la prima de riesgo— aumentó de manera estadísticamente significativa en el período posterior a la adopción del régimen de Metas de Inflación: +3,89 puntos porcentuales (p &lt; 0,001). Antes de 2011 dicho residuo era negativo (−2,27 pp): el diferencial nominal no compensaba siquiera el diferencial de inflación; después de 2011 emerge un residuo positivo (+1,63 pp).</w:t>
       </w:r>
     </w:p>
     <w:p>
@@ -12460,7 +12460,7 @@
         <w:jc w:val="both"/>
       </w:pPr>
       <w:r>
-        <w:t xml:space="preserve">Segunda. La composición contable del diferencial nominal cambió: el componente de inflación se comprimió (−2,83 pp; p &lt; 0,001) y el residual ganó peso. Esta es la primera capa de la hipótesis, y la evidencia la respalda con claridad, en coincidencia con el cambio de régimen.</w:t>
+        <w:t>Segunda. La composición contable del diferencial nominal cambió: el componente de inflación se comprimió (−3,07 pp; p &lt; 0,001) y el residual ganó peso. Esta es la primera capa de la hipótesis, y la evidencia la respalda con claridad, en coincidencia con el cambio de régimen.</w:t>
       </w:r>
     </w:p>
     <w:p>
@@ -12469,7 +12469,7 @@
         <w:jc w:val="both"/>
       </w:pPr>
       <w:r>
-        <w:t xml:space="preserve">Tercera. No se encontró evidencia de un cambio en la composición interna del residuo: la prueba conjunta de Wald sobre las interacciones de la volatilidad cambiaria y de la dolarización con el régimen no rechaza la estabilidad de las pendientes (F = 0,33; p = 0,717), y la prueba de dominancia estandarizada resulta no concluyente (p = 0,781). El quiebre asociado a 2011 es, con la serie primaria, un cambio de nivel (Chow: p &lt; 0,001), no de pendientes. Este resultado se reporta tal como surge; el análisis de sensibilidad muestra que la evidencia de pendientes depende de la definición de la serie de tasas, y esa dependencia se declara como hallazgo.</w:t>
+        <w:t>Tercera. No se encontró evidencia de un cambio en la composición interna del residuo: la prueba conjunta de Wald sobre las interacciones de la volatilidad cambiaria y de la dolarización con el régimen no rechaza la estabilidad de las pendientes (F = 2,00; p = 0,142), y la prueba de dominancia estandarizada resulta no concluyente (p = 0,657). El quiebre asociado a 2011 es, con la serie primaria, un cambio de nivel (Chow: p &lt; 0,001), no de pendientes. Este resultado se reporta tal como surge; el análisis de sensibilidad muestra que la evidencia de pendientes depende de la definición de la serie de tasas, y esa dependencia se declara como hallazgo.</w:t>
       </w:r>
     </w:p>
     <w:p>

</xml_diff>

<commit_message>
Word: bibliografia APA reordenada + figuras nativas de Stata (8.1/8.2/8.3); manifiesto Rev.3.1
- Referencias ordenadas alfabeticamente (BCP agrupado por año; U.S. BLS al final).
- Figuras del cuerpo reemplazadas por las de Stata con correccion de aspecto.
- Se versionan tambien el Apendice y el Guion de defensa.
</commit_message>
<xml_diff>
--- a/Scavone_Fernandez_Tesis_FINAL_2026-07-17.docx
+++ b/Scavone_Fernandez_Tesis_FINAL_2026-07-17.docx
@@ -8634,7 +8634,7 @@
         </w:rPr>
         <w:drawing>
           <wp:inline distT="0" distB="0" distL="0" distR="0">
-            <wp:extent cx="5400000" cy="2552727"/>
+            <wp:extent cx="5400000" cy="3928500"/>
             <wp:effectExtent l="0" t="0" r="0" b="0"/>
             <wp:docPr id="9001" name="FiguraR1" descr="Serie trimestral del diferencial de retorno DR"/>
             <wp:cNvGraphicFramePr>
@@ -8656,7 +8656,7 @@
                   <pic:spPr>
                     <a:xfrm>
                       <a:off x="0" y="0"/>
-                      <a:ext cx="5400000" cy="2552727"/>
+                      <a:ext cx="5400000" cy="3928500"/>
                     </a:xfrm>
                     <a:prstGeom prst="rect">
                       <a:avLst/>
@@ -9932,7 +9932,7 @@
         </w:rPr>
         <w:drawing>
           <wp:inline distT="0" distB="0" distL="0" distR="0">
-            <wp:extent cx="5400000" cy="3600000"/>
+            <wp:extent cx="5400000" cy="3928500"/>
             <wp:effectExtent l="0" t="0" r="0" b="0"/>
             <wp:docPr id="9002" name="FiguraR2" descr="Descomposicion de Fisher del diferencial"/>
             <wp:cNvGraphicFramePr>
@@ -9954,7 +9954,7 @@
                   <pic:spPr>
                     <a:xfrm>
                       <a:off x="0" y="0"/>
-                      <a:ext cx="5400000" cy="3600000"/>
+                      <a:ext cx="5400000" cy="3928500"/>
                     </a:xfrm>
                     <a:prstGeom prst="rect">
                       <a:avLst/>
@@ -11596,7 +11596,7 @@
         </w:rPr>
         <w:drawing>
           <wp:inline distT="0" distB="0" distL="0" distR="0">
-            <wp:extent cx="5400000" cy="3600000"/>
+            <wp:extent cx="5400000" cy="3928500"/>
             <wp:effectExtent l="0" t="0" r="0" b="0"/>
             <wp:docPr id="9003" name="FiguraR3" descr="Evolucion historica de la composicion de la prima de riesgo"/>
             <wp:cNvGraphicFramePr>
@@ -11618,7 +11618,7 @@
                   <pic:spPr>
                     <a:xfrm>
                       <a:off x="0" y="0"/>
-                      <a:ext cx="5400000" cy="3600000"/>
+                      <a:ext cx="5400000" cy="3928500"/>
                     </a:xfrm>
                     <a:prstGeom prst="rect">
                       <a:avLst/>
@@ -12686,6 +12686,24 @@
     </w:p>
     <w:p>
       <w:pPr>
+        <w:spacing w:after="160" w:line="300" w:lineRule="auto"/>
+        <w:jc w:val="both"/>
+      </w:pPr>
+      <w:r>
+        <w:t xml:space="preserve">Banco Central del Paraguay. (2024). Resolución N.º 48, Acta N.º 60 (16 de diciembre de 2024): meta de inflación de 3,5 % ± 2 pp. Banco Central del Paraguay. https://www.bcp.gov.py/</w:t>
+      </w:r>
+    </w:p>
+    <w:p>
+      <w:pPr>
+        <w:spacing w:after="160" w:line="300" w:lineRule="auto"/>
+        <w:jc w:val="both"/>
+      </w:pPr>
+      <w:r>
+        <w:t xml:space="preserve">Banco Central del Paraguay. (2026). Tasa de Política Monetaria (serie histórica) [Conjunto de datos]. https://www.bcp.gov.py/tasa-de-politica-monetaria</w:t>
+      </w:r>
+    </w:p>
+    <w:p>
+      <w:pPr>
         <w:spacing w:after="120" w:line="240" w:lineRule="auto"/>
         <w:ind w:left="720" w:hanging="720"/>
         <w:jc w:val="both"/>
@@ -13264,33 +13282,6 @@
     </w:p>
     <w:p>
       <w:pPr>
-        <w:spacing w:after="160" w:line="300" w:lineRule="auto"/>
-        <w:jc w:val="both"/>
-      </w:pPr>
-      <w:r>
-        <w:t xml:space="preserve">Banco Central del Paraguay. (2024). Resolución N.º 48, Acta N.º 60 (16 de diciembre de 2024): meta de inflación de 3,5 % ± 2 pp. Banco Central del Paraguay. https://www.bcp.gov.py/</w:t>
-      </w:r>
-    </w:p>
-    <w:p>
-      <w:pPr>
-        <w:spacing w:after="160" w:line="300" w:lineRule="auto"/>
-        <w:jc w:val="both"/>
-      </w:pPr>
-      <w:r>
-        <w:t xml:space="preserve">Banco Central del Paraguay. (2026). Tasa de Política Monetaria (serie histórica) [Conjunto de datos]. https://www.bcp.gov.py/tasa-de-politica-monetaria</w:t>
-      </w:r>
-    </w:p>
-    <w:p>
-      <w:pPr>
-        <w:spacing w:after="160" w:line="300" w:lineRule="auto"/>
-        <w:jc w:val="both"/>
-      </w:pPr>
-      <w:r>
-        <w:t xml:space="preserve">U.S. Bureau of Labor Statistics. (2026). Consumer Price Index for All Urban Consumers: All Items in U.S. City Average (CPIAUCSL) [Conjunto de datos]. FRED, Federal Reserve Bank of St. Louis. https://fred.stlouisfed.org/series/CPIAUCSL</w:t>
-      </w:r>
-    </w:p>
-    <w:p>
-      <w:pPr>
         <w:spacing w:after="120" w:line="240" w:lineRule="auto"/>
         <w:ind w:left="720" w:hanging="720"/>
         <w:jc w:val="both"/>
@@ -13525,6 +13516,15 @@
           <w:lang w:val="es-ES" w:eastAsia="es-ES"/>
         </w:rPr>
         <w:t>(6), 1111–1146.</w:t>
+      </w:r>
+    </w:p>
+    <w:p>
+      <w:pPr>
+        <w:spacing w:after="160" w:line="300" w:lineRule="auto"/>
+        <w:jc w:val="both"/>
+      </w:pPr>
+      <w:r>
+        <w:t xml:space="preserve">U.S. Bureau of Labor Statistics. (2026). Consumer Price Index for All Urban Consumers: All Items in U.S. City Average (CPIAUCSL) [Conjunto de datos]. FRED, Federal Reserve Bank of St. Louis. https://fred.stlouisfed.org/series/CPIAUCSL</w:t>
       </w:r>
     </w:p>
     <w:p>

</xml_diff>